<commit_message>
Update agent metadata and migration documentation
Replit-Commit-Author: Agent
</commit_message>
<xml_diff>
--- a/docs/multi-grade-bell-schedule-migration.docx
+++ b/docs/multi-grade-bell-schedule-migration.docx
@@ -3126,6 +3126,24 @@
       </w:r>
       <w:r>
         <w:t xml:space="preserve">.</w:t>
+      </w:r>
+    </w:p>
+    <w:p>
+      <w:pPr>
+        <w:pStyle w:val="Compact"/>
+        <w:numPr>
+          <w:ilvl w:val="0"/>
+          <w:numId w:val="1005"/>
+        </w:numPr>
+      </w:pPr>
+      <w:r>
+        <w:t xml:space="preserve">In-editor guidance banner (</w:t>
+      </w:r>
+      <w:r>
+        <w:t xml:space="preserve">“How this works”</w:t>
+      </w:r>
+      <w:r>
+        <w:t xml:space="preserve">) at the top of the schedule editor: on the New form it explains the two-step process (save default periods first, then reopen to add grade variants); on the Edit form it directs admins to the variants section and notes that once grade variants exist, timing edits belong there rather than in the legacy period list.</w:t>
       </w:r>
     </w:p>
     <w:p>

</xml_diff>